<commit_message>
Update LLD Word document (.docx) with Low-Level Component Architecture Diagram
</commit_message>
<xml_diff>
--- a/Agent_Policy_and_Compliance_Tower_LLD.docx
+++ b/Agent_Policy_and_Compliance_Tower_LLD.docx
@@ -29,7 +29,7 @@
         </w:rPr>
         <w:t>Low-Level Technical Design Document (LLD)</w:t>
         <w:br/>
-        <w:t>Detailed Implementation Specifications, Code Interfaces, Schemas &amp; API Endpoints</w:t>
+        <w:t>Component Architecture Diagram, Class Interfaces, Schemas &amp; API Specifications</w:t>
       </w:r>
     </w:p>
     <w:tbl>
@@ -90,7 +90,7 @@
                 <w:color w:val="3C4043"/>
                 <w:sz w:val="19"/>
               </w:rPr>
-              <w:t>1.0 (Production Low-Level Technical Design)</w:t>
+              <w:t>2.0 (Production LLD with Component Architecture Diagram)</w:t>
             </w:r>
           </w:p>
         </w:tc>
@@ -288,7 +288,88 @@
           <w:color w:val="1A73E8"/>
           <w:sz w:val="30"/>
         </w:rPr>
-        <w:t>2. Policy Gateway Middleware Implementation Specs</w:t>
+        <w:t>2. Low-Level Component Architecture Diagram</w:t>
+      </w:r>
+    </w:p>
+    <w:p>
+      <w:pPr>
+        <w:spacing w:after="160"/>
+      </w:pPr>
+      <w:r>
+        <w:t>The diagram below illustrates the detailed internal component architecture, class pipelines, API gateways, database schemas, and cryptographic signing flows across all system modules:</w:t>
+      </w:r>
+    </w:p>
+    <w:p>
+      <w:pPr>
+        <w:spacing w:before="120" w:after="80"/>
+        <w:jc w:val="center"/>
+      </w:pPr>
+      <w:r>
+        <w:drawing>
+          <wp:inline xmlns:a="http://schemas.openxmlformats.org/drawingml/2006/main" xmlns:pic="http://schemas.openxmlformats.org/drawingml/2006/picture">
+            <wp:extent cx="5669280" cy="5669280"/>
+            <wp:docPr id="1" name="Picture 1"/>
+            <wp:cNvGraphicFramePr>
+              <a:graphicFrameLocks noChangeAspect="1"/>
+            </wp:cNvGraphicFramePr>
+            <a:graphic>
+              <a:graphicData uri="http://schemas.openxmlformats.org/drawingml/2006/picture">
+                <pic:pic>
+                  <pic:nvPicPr>
+                    <pic:cNvPr id="0" name="lld_architecture_diagram.png"/>
+                    <pic:cNvPicPr/>
+                  </pic:nvPicPr>
+                  <pic:blipFill>
+                    <a:blip r:embed="rId9"/>
+                    <a:stretch>
+                      <a:fillRect/>
+                    </a:stretch>
+                  </pic:blipFill>
+                  <pic:spPr>
+                    <a:xfrm>
+                      <a:off x="0" y="0"/>
+                      <a:ext cx="5669280" cy="5669280"/>
+                    </a:xfrm>
+                    <a:prstGeom prst="rect"/>
+                  </pic:spPr>
+                </pic:pic>
+              </a:graphicData>
+            </a:graphic>
+          </wp:inline>
+        </w:drawing>
+      </w:r>
+    </w:p>
+    <w:p>
+      <w:pPr>
+        <w:spacing w:after="240"/>
+        <w:jc w:val="center"/>
+      </w:pPr>
+      <w:r>
+        <w:rPr>
+          <w:b/>
+          <w:i/>
+          <w:color w:val="5F6368"/>
+          <w:sz w:val="18"/>
+        </w:rPr>
+        <w:t>Figure 1: Low-Level Component Architecture &amp; Technical Sequence Diagram — Agent Policy and Compliance Tower</w:t>
+      </w:r>
+    </w:p>
+    <w:p>
+      <w:pPr>
+        <w:spacing w:after="200"/>
+      </w:pPr>
+    </w:p>
+    <w:p>
+      <w:pPr>
+        <w:spacing w:before="280" w:after="120"/>
+      </w:pPr>
+      <w:r>
+        <w:rPr>
+          <w:b/>
+          <w:color w:val="1A73E8"/>
+          <w:sz w:val="30"/>
+        </w:rPr>
+        <w:t>3. Policy Gateway Middleware Implementation Specs</w:t>
       </w:r>
     </w:p>
     <w:p>
@@ -780,7 +861,7 @@
           <w:color w:val="1A73E8"/>
           <w:sz w:val="30"/>
         </w:rPr>
-        <w:t>3. Gemini Agent Runtime &amp; Multi-Agent Network Specs</w:t>
+        <w:t>4. Gemini Agent Runtime &amp; Multi-Agent Network Specs</w:t>
       </w:r>
     </w:p>
     <w:p>
@@ -866,7 +947,7 @@
           <w:color w:val="1A73E8"/>
           <w:sz w:val="30"/>
         </w:rPr>
-        <w:t>4. Cryptographic Audit Ledger &amp; BigQuery DDL Schema</w:t>
+        <w:t>5. Cryptographic Audit Ledger &amp; BigQuery DDL Schema</w:t>
       </w:r>
     </w:p>
     <w:p>
@@ -929,7 +1010,7 @@
           <w:color w:val="1A73E8"/>
           <w:sz w:val="30"/>
         </w:rPr>
-        <w:t>5. REST API Endpoints &amp; OpenAPI Specifications</w:t>
+        <w:t>6. REST API Endpoints &amp; OpenAPI Specifications</w:t>
       </w:r>
     </w:p>
     <w:tbl>
@@ -1395,7 +1476,7 @@
           <w:color w:val="1A73E8"/>
           <w:sz w:val="30"/>
         </w:rPr>
-        <w:t>6. Live Application Implementation Screenshots (http://localhost:8081/)</w:t>
+        <w:t>7. Live Application Implementation Screenshots (http://localhost:8081/)</w:t>
       </w:r>
     </w:p>
     <w:p>
@@ -1428,7 +1509,7 @@
         <w:drawing>
           <wp:inline xmlns:a="http://schemas.openxmlformats.org/drawingml/2006/main" xmlns:pic="http://schemas.openxmlformats.org/drawingml/2006/picture">
             <wp:extent cx="5486400" cy="3429000"/>
-            <wp:docPr id="1" name="Picture 1"/>
+            <wp:docPr id="2" name="Picture 2"/>
             <wp:cNvGraphicFramePr>
               <a:graphicFrameLocks noChangeAspect="1"/>
             </wp:cNvGraphicFramePr>
@@ -1437,81 +1518,6 @@
                 <pic:pic>
                   <pic:nvPicPr>
                     <pic:cNvPr id="0" name="app_rules.png"/>
-                    <pic:cNvPicPr/>
-                  </pic:nvPicPr>
-                  <pic:blipFill>
-                    <a:blip r:embed="rId9"/>
-                    <a:stretch>
-                      <a:fillRect/>
-                    </a:stretch>
-                  </pic:blipFill>
-                  <pic:spPr>
-                    <a:xfrm>
-                      <a:off x="0" y="0"/>
-                      <a:ext cx="5486400" cy="3429000"/>
-                    </a:xfrm>
-                    <a:prstGeom prst="rect"/>
-                  </pic:spPr>
-                </pic:pic>
-              </a:graphicData>
-            </a:graphic>
-          </wp:inline>
-        </w:drawing>
-      </w:r>
-    </w:p>
-    <w:p>
-      <w:pPr>
-        <w:spacing w:after="200"/>
-        <w:jc w:val="center"/>
-      </w:pPr>
-      <w:r>
-        <w:rPr>
-          <w:i/>
-          <w:color w:val="5F6368"/>
-          <w:sz w:val="18"/>
-        </w:rPr>
-        <w:t>Figure 1: Live Application Screenshot from http://localhost:8081/?tab=rules — Policy Engine Rules &amp; Regex Patterns</w:t>
-      </w:r>
-    </w:p>
-    <w:p>
-      <w:pPr>
-        <w:spacing w:before="240" w:after="80"/>
-      </w:pPr>
-      <w:r>
-        <w:rPr>
-          <w:b/>
-          <w:color w:val="1A73E8"/>
-          <w:sz w:val="25"/>
-        </w:rPr>
-        <w:t>Module 2: Regulatory Compliance Auditor</w:t>
-      </w:r>
-    </w:p>
-    <w:p>
-      <w:pPr>
-        <w:spacing w:after="120"/>
-      </w:pPr>
-      <w:r>
-        <w:t>Renders interactive compliance checklists across HIPAA, SOC 2 Type II, EU GDPR Art. 17, India DPDP Act 2023, and Gemini Trust.</w:t>
-      </w:r>
-    </w:p>
-    <w:p>
-      <w:pPr>
-        <w:spacing w:before="80" w:after="80"/>
-        <w:jc w:val="center"/>
-      </w:pPr>
-      <w:r>
-        <w:drawing>
-          <wp:inline xmlns:a="http://schemas.openxmlformats.org/drawingml/2006/main" xmlns:pic="http://schemas.openxmlformats.org/drawingml/2006/picture">
-            <wp:extent cx="5486400" cy="3429000"/>
-            <wp:docPr id="2" name="Picture 2"/>
-            <wp:cNvGraphicFramePr>
-              <a:graphicFrameLocks noChangeAspect="1"/>
-            </wp:cNvGraphicFramePr>
-            <a:graphic>
-              <a:graphicData uri="http://schemas.openxmlformats.org/drawingml/2006/picture">
-                <pic:pic>
-                  <pic:nvPicPr>
-                    <pic:cNvPr id="0" name="module2_compliance_auditor.png"/>
                     <pic:cNvPicPr/>
                   </pic:nvPicPr>
                   <pic:blipFill>
@@ -1545,7 +1551,7 @@
           <w:color w:val="5F6368"/>
           <w:sz w:val="18"/>
         </w:rPr>
-        <w:t>Figure 2: Live Application Screenshot from http://localhost:8081/?tab=compliance — Multi-Framework Compliance Auditor</w:t>
+        <w:t>Figure 2: Live Application Screenshot from http://localhost:8081/?tab=rules — Policy Engine Rules &amp; Regex Patterns</w:t>
       </w:r>
     </w:p>
     <w:p>
@@ -1558,7 +1564,7 @@
           <w:color w:val="1A73E8"/>
           <w:sz w:val="25"/>
         </w:rPr>
-        <w:t>Module 3: Safety Guardrails &amp; Agent Search Grounding Engine</w:t>
+        <w:t>Module 2: Regulatory Compliance Auditor</w:t>
       </w:r>
     </w:p>
     <w:p>
@@ -1566,7 +1572,7 @@
         <w:spacing w:after="120"/>
       </w:pPr>
       <w:r>
-        <w:t>Binds safety threshold sliders and fact-checks model outputs against enterprise knowledge stores (98% precision).</w:t>
+        <w:t>Renders interactive compliance checklists across HIPAA, SOC 2 Type II, EU GDPR Art. 17, India DPDP Act 2023, and Gemini Trust.</w:t>
       </w:r>
     </w:p>
     <w:p>
@@ -1586,7 +1592,7 @@
               <a:graphicData uri="http://schemas.openxmlformats.org/drawingml/2006/picture">
                 <pic:pic>
                   <pic:nvPicPr>
-                    <pic:cNvPr id="0" name="app_grounding.png"/>
+                    <pic:cNvPr id="0" name="module2_compliance_auditor.png"/>
                     <pic:cNvPicPr/>
                   </pic:nvPicPr>
                   <pic:blipFill>
@@ -1620,7 +1626,7 @@
           <w:color w:val="5F6368"/>
           <w:sz w:val="18"/>
         </w:rPr>
-        <w:t>Figure 3: Live Application Screenshot from http://localhost:8081/?tab=grounding — Agent Search Citation Grounding Console</w:t>
+        <w:t>Figure 3: Live Application Screenshot from http://localhost:8081/?tab=compliance — Multi-Framework Compliance Auditor</w:t>
       </w:r>
     </w:p>
     <w:p>
@@ -1633,7 +1639,7 @@
           <w:color w:val="1A73E8"/>
           <w:sz w:val="25"/>
         </w:rPr>
-        <w:t>Module 4: Cryptographic Audit Ledger Terminal</w:t>
+        <w:t>Module 3: Safety Guardrails &amp; Agent Search Grounding Engine</w:t>
       </w:r>
     </w:p>
     <w:p>
@@ -1641,7 +1647,7 @@
         <w:spacing w:after="120"/>
       </w:pPr>
       <w:r>
-        <w:t>Displays SHA-256 block chain linkage (current.prevHash === prev.hash) signed via Cloud KMS RSA-PSS asymmetric key rings.</w:t>
+        <w:t>Binds safety threshold sliders and fact-checks model outputs against enterprise knowledge stores (98% precision).</w:t>
       </w:r>
     </w:p>
     <w:p>
@@ -1661,7 +1667,7 @@
               <a:graphicData uri="http://schemas.openxmlformats.org/drawingml/2006/picture">
                 <pic:pic>
                   <pic:nvPicPr>
-                    <pic:cNvPr id="0" name="app_audit.png"/>
+                    <pic:cNvPr id="0" name="app_grounding.png"/>
                     <pic:cNvPicPr/>
                   </pic:nvPicPr>
                   <pic:blipFill>
@@ -1695,7 +1701,82 @@
           <w:color w:val="5F6368"/>
           <w:sz w:val="18"/>
         </w:rPr>
-        <w:t>Figure 4: Live Application Screenshot from http://localhost:8081/?tab=audit — Tamper-Evident Audit Terminal</w:t>
+        <w:t>Figure 4: Live Application Screenshot from http://localhost:8081/?tab=grounding — Agent Search Citation Grounding Console</w:t>
+      </w:r>
+    </w:p>
+    <w:p>
+      <w:pPr>
+        <w:spacing w:before="240" w:after="80"/>
+      </w:pPr>
+      <w:r>
+        <w:rPr>
+          <w:b/>
+          <w:color w:val="1A73E8"/>
+          <w:sz w:val="25"/>
+        </w:rPr>
+        <w:t>Module 4: Cryptographic Audit Ledger Terminal</w:t>
+      </w:r>
+    </w:p>
+    <w:p>
+      <w:pPr>
+        <w:spacing w:after="120"/>
+      </w:pPr>
+      <w:r>
+        <w:t>Displays SHA-256 block chain linkage (current.prevHash === prev.hash) signed via Cloud KMS RSA-PSS asymmetric key rings.</w:t>
+      </w:r>
+    </w:p>
+    <w:p>
+      <w:pPr>
+        <w:spacing w:before="80" w:after="80"/>
+        <w:jc w:val="center"/>
+      </w:pPr>
+      <w:r>
+        <w:drawing>
+          <wp:inline xmlns:a="http://schemas.openxmlformats.org/drawingml/2006/main" xmlns:pic="http://schemas.openxmlformats.org/drawingml/2006/picture">
+            <wp:extent cx="5486400" cy="3429000"/>
+            <wp:docPr id="5" name="Picture 5"/>
+            <wp:cNvGraphicFramePr>
+              <a:graphicFrameLocks noChangeAspect="1"/>
+            </wp:cNvGraphicFramePr>
+            <a:graphic>
+              <a:graphicData uri="http://schemas.openxmlformats.org/drawingml/2006/picture">
+                <pic:pic>
+                  <pic:nvPicPr>
+                    <pic:cNvPr id="0" name="app_audit.png"/>
+                    <pic:cNvPicPr/>
+                  </pic:nvPicPr>
+                  <pic:blipFill>
+                    <a:blip r:embed="rId13"/>
+                    <a:stretch>
+                      <a:fillRect/>
+                    </a:stretch>
+                  </pic:blipFill>
+                  <pic:spPr>
+                    <a:xfrm>
+                      <a:off x="0" y="0"/>
+                      <a:ext cx="5486400" cy="3429000"/>
+                    </a:xfrm>
+                    <a:prstGeom prst="rect"/>
+                  </pic:spPr>
+                </pic:pic>
+              </a:graphicData>
+            </a:graphic>
+          </wp:inline>
+        </w:drawing>
+      </w:r>
+    </w:p>
+    <w:p>
+      <w:pPr>
+        <w:spacing w:after="200"/>
+        <w:jc w:val="center"/>
+      </w:pPr>
+      <w:r>
+        <w:rPr>
+          <w:i/>
+          <w:color w:val="5F6368"/>
+          <w:sz w:val="18"/>
+        </w:rPr>
+        <w:t>Figure 5: Live Application Screenshot from http://localhost:8081/?tab=audit — Tamper-Evident Audit Terminal</w:t>
       </w:r>
     </w:p>
     <w:sectPr>

</xml_diff>